<commit_message>
docs: add caso de uso registrar venta
</commit_message>
<xml_diff>
--- a/documentacion proyecto/CU-001_Registrar_Venta_POS.docx
+++ b/documentacion proyecto/CU-001_Registrar_Venta_POS.docx
@@ -5,8 +5,14 @@
     <w:p>
       <w:pPr>
         <w:pStyle w:val="Ttulo1"/>
-      </w:pPr>
-      <w:r>
+        <w:rPr>
+          <w:lang w:val="es-ES"/>
+        </w:rPr>
+      </w:pPr>
+      <w:r>
+        <w:rPr>
+          <w:lang w:val="es-ES"/>
+        </w:rPr>
         <w:t>Caso de Uso: CU-001 - Registrar venta (POS/TPV)</w:t>
       </w:r>
     </w:p>
@@ -21,13 +27,20 @@
     <w:p>
       <w:pPr>
         <w:pStyle w:val="Ttulo2"/>
-      </w:pPr>
-      <w:r>
+        <w:rPr>
+          <w:lang w:val="es-ES"/>
+        </w:rPr>
+      </w:pPr>
+      <w:r>
+        <w:rPr>
+          <w:lang w:val="es-ES"/>
+        </w:rPr>
         <w:t>1. Identificación</w:t>
       </w:r>
     </w:p>
     <w:p>
       <w:pPr>
+        <w:spacing w:after="0"/>
         <w:rPr>
           <w:rFonts w:asciiTheme="minorHAnsi" w:hAnsiTheme="minorHAnsi"/>
           <w:lang w:val="es-ES"/>
@@ -51,6 +64,7 @@
     </w:p>
     <w:p>
       <w:pPr>
+        <w:spacing w:after="0"/>
         <w:rPr>
           <w:rFonts w:asciiTheme="minorHAnsi" w:hAnsiTheme="minorHAnsi"/>
           <w:lang w:val="es-ES"/>
@@ -74,6 +88,7 @@
     </w:p>
     <w:p>
       <w:pPr>
+        <w:spacing w:after="0"/>
         <w:rPr>
           <w:rFonts w:asciiTheme="minorHAnsi" w:hAnsiTheme="minorHAnsi"/>
           <w:lang w:val="es-ES"/>
@@ -97,6 +112,7 @@
     </w:p>
     <w:p>
       <w:pPr>
+        <w:spacing w:after="0"/>
         <w:rPr>
           <w:rFonts w:asciiTheme="minorHAnsi" w:hAnsiTheme="minorHAnsi"/>
           <w:lang w:val="es-ES"/>
@@ -120,6 +136,7 @@
     </w:p>
     <w:p>
       <w:pPr>
+        <w:spacing w:after="0"/>
         <w:rPr>
           <w:rFonts w:asciiTheme="minorHAnsi" w:hAnsiTheme="minorHAnsi"/>
           <w:lang w:val="es-ES"/>
@@ -138,11 +155,12 @@
           <w:rFonts w:asciiTheme="minorHAnsi" w:hAnsiTheme="minorHAnsi"/>
           <w:lang w:val="es-ES"/>
         </w:rPr>
-        <w:t>Equipo</w:t>
-      </w:r>
-    </w:p>
-    <w:p>
-      <w:pPr>
+        <w:t>Fu Jun Fu Lin</w:t>
+      </w:r>
+    </w:p>
+    <w:p>
+      <w:pPr>
+        <w:spacing w:after="0"/>
         <w:rPr>
           <w:rFonts w:asciiTheme="minorHAnsi" w:hAnsiTheme="minorHAnsi"/>
           <w:lang w:val="es-ES"/>
@@ -166,6 +184,7 @@
     </w:p>
     <w:p>
       <w:pPr>
+        <w:spacing w:after="0"/>
         <w:rPr>
           <w:rFonts w:asciiTheme="minorHAnsi" w:hAnsiTheme="minorHAnsi"/>
           <w:lang w:val="es-ES"/>
@@ -189,6 +208,7 @@
     </w:p>
     <w:p>
       <w:pPr>
+        <w:spacing w:after="0"/>
         <w:rPr>
           <w:rFonts w:asciiTheme="minorHAnsi" w:hAnsiTheme="minorHAnsi"/>
           <w:lang w:val="es-ES"/>
@@ -212,6 +232,7 @@
     </w:p>
     <w:p>
       <w:pPr>
+        <w:spacing w:after="0"/>
         <w:rPr>
           <w:rFonts w:asciiTheme="minorHAnsi" w:hAnsiTheme="minorHAnsi"/>
           <w:lang w:val="es-ES"/>
@@ -236,8 +257,14 @@
     <w:p>
       <w:pPr>
         <w:pStyle w:val="Ttulo2"/>
-      </w:pPr>
-      <w:r>
+        <w:rPr>
+          <w:lang w:val="es-ES"/>
+        </w:rPr>
+      </w:pPr>
+      <w:r>
+        <w:rPr>
+          <w:lang w:val="es-ES"/>
+        </w:rPr>
         <w:t>2. Resumen</w:t>
       </w:r>
     </w:p>
@@ -262,7 +289,7 @@
           <w:rFonts w:asciiTheme="minorHAnsi" w:hAnsiTheme="minorHAnsi"/>
           <w:lang w:val="es-ES"/>
         </w:rPr>
-        <w:t>El cajero registra una venta seleccionando productos, aplicando descuentos y cobrando al cliente.</w:t>
+        <w:t>El cajero registra una venta seleccionando productos y cobrando al cliente.</w:t>
       </w:r>
     </w:p>
     <w:p>
@@ -302,14 +329,48 @@
           <w:rFonts w:asciiTheme="minorHAnsi" w:hAnsiTheme="minorHAnsi"/>
           <w:lang w:val="es-ES"/>
         </w:rPr>
-        <w:t>/recibo, registrar el pago y actualizar el stock.</w:t>
+        <w:t>/recibo</w:t>
+      </w:r>
+      <w:r>
+        <w:rPr>
+          <w:rFonts w:asciiTheme="minorHAnsi" w:hAnsiTheme="minorHAnsi"/>
+          <w:lang w:val="es-ES"/>
+        </w:rPr>
+        <w:t xml:space="preserve"> y</w:t>
+      </w:r>
+      <w:r>
+        <w:rPr>
+          <w:rFonts w:asciiTheme="minorHAnsi" w:hAnsiTheme="minorHAnsi"/>
+          <w:lang w:val="es-ES"/>
+        </w:rPr>
+        <w:t xml:space="preserve"> registrar el pag</w:t>
+      </w:r>
+      <w:r>
+        <w:rPr>
+          <w:rFonts w:asciiTheme="minorHAnsi" w:hAnsiTheme="minorHAnsi"/>
+          <w:lang w:val="es-ES"/>
+        </w:rPr>
+        <w:t>o</w:t>
+      </w:r>
+      <w:r>
+        <w:rPr>
+          <w:rFonts w:asciiTheme="minorHAnsi" w:hAnsiTheme="minorHAnsi"/>
+          <w:lang w:val="es-ES"/>
+        </w:rPr>
+        <w:t>.</w:t>
       </w:r>
     </w:p>
     <w:p>
       <w:pPr>
         <w:pStyle w:val="Ttulo2"/>
-      </w:pPr>
-      <w:r>
+        <w:rPr>
+          <w:lang w:val="es-ES"/>
+        </w:rPr>
+      </w:pPr>
+      <w:r>
+        <w:rPr>
+          <w:lang w:val="es-ES"/>
+        </w:rPr>
         <w:t>3. Actores y partes interesadas</w:t>
       </w:r>
     </w:p>
@@ -375,32 +436,76 @@
           <w:b/>
           <w:lang w:val="es-ES"/>
         </w:rPr>
-        <w:t>Interesados (</w:t>
-      </w:r>
-      <w:proofErr w:type="spellStart"/>
+        <w:t xml:space="preserve">Interesados: </w:t>
+      </w:r>
+      <w:r>
+        <w:rPr>
+          <w:rFonts w:asciiTheme="minorHAnsi" w:hAnsiTheme="minorHAnsi"/>
+          <w:lang w:val="es-ES"/>
+        </w:rPr>
+        <w:t>Operaciones, Contabilidad, Soporte</w:t>
+      </w:r>
+    </w:p>
+    <w:p>
+      <w:pPr>
+        <w:pStyle w:val="Ttulo2"/>
+        <w:rPr>
+          <w:lang w:val="es-ES"/>
+        </w:rPr>
+      </w:pPr>
+      <w:r>
+        <w:rPr>
+          <w:lang w:val="es-ES"/>
+        </w:rPr>
+        <w:t>4. Precondiciones y disparadores</w:t>
+      </w:r>
+    </w:p>
+    <w:p>
+      <w:pPr>
+        <w:spacing w:after="0"/>
+        <w:rPr>
+          <w:rFonts w:asciiTheme="minorHAnsi" w:hAnsiTheme="minorHAnsi"/>
+          <w:lang w:val="es-ES"/>
+        </w:rPr>
+      </w:pPr>
       <w:r>
         <w:rPr>
           <w:rFonts w:asciiTheme="minorHAnsi" w:hAnsiTheme="minorHAnsi"/>
           <w:b/>
           <w:lang w:val="es-ES"/>
         </w:rPr>
-        <w:t>stakeholders</w:t>
-      </w:r>
-      <w:proofErr w:type="spellEnd"/>
+        <w:t xml:space="preserve">Precondiciones: </w:t>
+      </w:r>
+      <w:r>
+        <w:rPr>
+          <w:rFonts w:asciiTheme="minorHAnsi" w:hAnsiTheme="minorHAnsi"/>
+          <w:lang w:val="es-ES"/>
+        </w:rPr>
+        <w:t>El usuario está autenticado; caja/turno abierto; catálogo y precios disponibles; impresora configurada (si aplica).</w:t>
+      </w:r>
+    </w:p>
+    <w:p>
+      <w:pPr>
+        <w:spacing w:after="0"/>
+        <w:rPr>
+          <w:rFonts w:asciiTheme="minorHAnsi" w:hAnsiTheme="minorHAnsi"/>
+          <w:lang w:val="es-ES"/>
+        </w:rPr>
+      </w:pPr>
       <w:r>
         <w:rPr>
           <w:rFonts w:asciiTheme="minorHAnsi" w:hAnsiTheme="minorHAnsi"/>
           <w:b/>
           <w:lang w:val="es-ES"/>
         </w:rPr>
-        <w:t xml:space="preserve">): </w:t>
-      </w:r>
-      <w:r>
-        <w:rPr>
-          <w:rFonts w:asciiTheme="minorHAnsi" w:hAnsiTheme="minorHAnsi"/>
-          <w:lang w:val="es-ES"/>
-        </w:rPr>
-        <w:t>Operaciones, Contabilidad, Soporte</w:t>
+        <w:t xml:space="preserve">Disparador: </w:t>
+      </w:r>
+      <w:r>
+        <w:rPr>
+          <w:rFonts w:asciiTheme="minorHAnsi" w:hAnsiTheme="minorHAnsi"/>
+          <w:lang w:val="es-ES"/>
+        </w:rPr>
+        <w:t>El cliente solicita pagar una compra en el punto de venta.</w:t>
       </w:r>
     </w:p>
     <w:p>
@@ -408,12 +513,11 @@
         <w:pStyle w:val="Ttulo2"/>
       </w:pPr>
       <w:r>
-        <w:t>4. Precondiciones y disparadores</w:t>
-      </w:r>
-    </w:p>
-    <w:p>
-      <w:pPr>
-        <w:spacing w:after="0"/>
+        <w:t>5. Postcondiciones</w:t>
+      </w:r>
+    </w:p>
+    <w:p>
+      <w:pPr>
         <w:rPr>
           <w:rFonts w:asciiTheme="minorHAnsi" w:hAnsiTheme="minorHAnsi"/>
           <w:lang w:val="es-ES"/>
@@ -425,19 +529,34 @@
           <w:b/>
           <w:lang w:val="es-ES"/>
         </w:rPr>
-        <w:t xml:space="preserve">Precondiciones: </w:t>
-      </w:r>
-      <w:r>
-        <w:rPr>
-          <w:rFonts w:asciiTheme="minorHAnsi" w:hAnsiTheme="minorHAnsi"/>
-          <w:lang w:val="es-ES"/>
-        </w:rPr>
-        <w:t>El usuario está autenticado; caja/turno abierto; catálogo y precios disponibles; impresora configurada (si aplica).</w:t>
-      </w:r>
-    </w:p>
-    <w:p>
-      <w:pPr>
-        <w:spacing w:after="0"/>
+        <w:t xml:space="preserve">Postcondiciones de éxito: </w:t>
+      </w:r>
+      <w:r>
+        <w:rPr>
+          <w:rFonts w:asciiTheme="minorHAnsi" w:hAnsiTheme="minorHAnsi"/>
+          <w:lang w:val="es-ES"/>
+        </w:rPr>
+        <w:t xml:space="preserve">Venta registrada con líneas de detalle, pago asociado, </w:t>
+      </w:r>
+      <w:proofErr w:type="gramStart"/>
+      <w:r>
+        <w:rPr>
+          <w:rFonts w:asciiTheme="minorHAnsi" w:hAnsiTheme="minorHAnsi"/>
+          <w:lang w:val="es-ES"/>
+        </w:rPr>
+        <w:t>ticket</w:t>
+      </w:r>
+      <w:proofErr w:type="gramEnd"/>
+      <w:r>
+        <w:rPr>
+          <w:rFonts w:asciiTheme="minorHAnsi" w:hAnsiTheme="minorHAnsi"/>
+          <w:lang w:val="es-ES"/>
+        </w:rPr>
+        <w:t xml:space="preserve"> emitido (impreso o digital) y stock actualizado.</w:t>
+      </w:r>
+    </w:p>
+    <w:p>
+      <w:pPr>
         <w:rPr>
           <w:rFonts w:asciiTheme="minorHAnsi" w:hAnsiTheme="minorHAnsi"/>
           <w:lang w:val="es-ES"/>
@@ -449,77 +568,6 @@
           <w:b/>
           <w:lang w:val="es-ES"/>
         </w:rPr>
-        <w:t xml:space="preserve">Disparador: </w:t>
-      </w:r>
-      <w:r>
-        <w:rPr>
-          <w:rFonts w:asciiTheme="minorHAnsi" w:hAnsiTheme="minorHAnsi"/>
-          <w:lang w:val="es-ES"/>
-        </w:rPr>
-        <w:t>El cliente solicita pagar una compra en el punto de venta.</w:t>
-      </w:r>
-    </w:p>
-    <w:p>
-      <w:pPr>
-        <w:pStyle w:val="Ttulo2"/>
-      </w:pPr>
-      <w:r>
-        <w:t>5. Postcondiciones</w:t>
-      </w:r>
-    </w:p>
-    <w:p>
-      <w:pPr>
-        <w:rPr>
-          <w:rFonts w:asciiTheme="minorHAnsi" w:hAnsiTheme="minorHAnsi"/>
-          <w:lang w:val="es-ES"/>
-        </w:rPr>
-      </w:pPr>
-      <w:r>
-        <w:rPr>
-          <w:rFonts w:asciiTheme="minorHAnsi" w:hAnsiTheme="minorHAnsi"/>
-          <w:b/>
-          <w:lang w:val="es-ES"/>
-        </w:rPr>
-        <w:t xml:space="preserve">Postcondiciones de éxito: </w:t>
-      </w:r>
-      <w:r>
-        <w:rPr>
-          <w:rFonts w:asciiTheme="minorHAnsi" w:hAnsiTheme="minorHAnsi"/>
-          <w:lang w:val="es-ES"/>
-        </w:rPr>
-        <w:t xml:space="preserve">Venta registrada con líneas de detalle, pago asociado, </w:t>
-      </w:r>
-      <w:proofErr w:type="gramStart"/>
-      <w:r>
-        <w:rPr>
-          <w:rFonts w:asciiTheme="minorHAnsi" w:hAnsiTheme="minorHAnsi"/>
-          <w:lang w:val="es-ES"/>
-        </w:rPr>
-        <w:t>ticket</w:t>
-      </w:r>
-      <w:proofErr w:type="gramEnd"/>
-      <w:r>
-        <w:rPr>
-          <w:rFonts w:asciiTheme="minorHAnsi" w:hAnsiTheme="minorHAnsi"/>
-          <w:lang w:val="es-ES"/>
-        </w:rPr>
-        <w:t xml:space="preserve"> emitido (impreso o digital) y stock actualizado.</w:t>
-      </w:r>
-    </w:p>
-    <w:p>
-      <w:pPr>
-        <w:rPr>
-          <w:rFonts w:asciiTheme="minorHAnsi" w:hAnsiTheme="minorHAnsi"/>
-          <w:lang w:val="es-ES"/>
-        </w:rPr>
-      </w:pPr>
-      <w:r>
-        <w:rPr>
-          <w:rFonts w:asciiTheme="minorHAnsi" w:hAnsiTheme="minorHAnsi"/>
-          <w:b/>
-          <w:lang w:val="es-ES"/>
-        </w:rPr>
-        <w:lastRenderedPageBreak/>
         <w:t xml:space="preserve">Postcondiciones de fallo: </w:t>
       </w:r>
       <w:r>
@@ -575,6 +623,7 @@
           <w:rFonts w:asciiTheme="minorHAnsi" w:hAnsiTheme="minorHAnsi"/>
           <w:lang w:val="es-ES"/>
         </w:rPr>
+        <w:lastRenderedPageBreak/>
         <w:t>Si el pago es tarjeta, la venta solo se confirma si el pago es aprobado.</w:t>
       </w:r>
     </w:p>
@@ -1351,8 +1400,14 @@
     <w:p>
       <w:pPr>
         <w:pStyle w:val="Ttulo2"/>
-      </w:pPr>
-      <w:r>
+        <w:rPr>
+          <w:lang w:val="es-ES"/>
+        </w:rPr>
+      </w:pPr>
+      <w:r>
+        <w:rPr>
+          <w:lang w:val="es-ES"/>
+        </w:rPr>
         <w:t>8. Flujos alternativos / excepciones</w:t>
       </w:r>
     </w:p>
@@ -1413,7 +1468,52 @@
           <w:rFonts w:asciiTheme="minorHAnsi" w:hAnsiTheme="minorHAnsi"/>
           <w:lang w:val="es-ES"/>
         </w:rPr>
-        <w:t>A2. Stock insuficiente</w:t>
+        <w:t>E1. Pago con tarjeta rechazado</w:t>
+      </w:r>
+    </w:p>
+    <w:p>
+      <w:pPr>
+        <w:rPr>
+          <w:rFonts w:asciiTheme="minorHAnsi" w:hAnsiTheme="minorHAnsi"/>
+          <w:lang w:val="es-ES"/>
+        </w:rPr>
+      </w:pPr>
+      <w:r>
+        <w:rPr>
+          <w:rFonts w:asciiTheme="minorHAnsi" w:hAnsiTheme="minorHAnsi"/>
+          <w:lang w:val="es-ES"/>
+        </w:rPr>
+        <w:t xml:space="preserve">  - El proveedor rechaza la operación.</w:t>
+      </w:r>
+    </w:p>
+    <w:p>
+      <w:pPr>
+        <w:rPr>
+          <w:rFonts w:asciiTheme="minorHAnsi" w:hAnsiTheme="minorHAnsi"/>
+          <w:lang w:val="es-ES"/>
+        </w:rPr>
+      </w:pPr>
+      <w:r>
+        <w:rPr>
+          <w:rFonts w:asciiTheme="minorHAnsi" w:hAnsiTheme="minorHAnsi"/>
+          <w:lang w:val="es-ES"/>
+        </w:rPr>
+        <w:t xml:space="preserve">  - El sistema mantiene la venta 'en curso' o 'pendiente de pago' y permite reintentar o cambiar método.</w:t>
+      </w:r>
+    </w:p>
+    <w:p>
+      <w:pPr>
+        <w:rPr>
+          <w:rFonts w:asciiTheme="minorHAnsi" w:hAnsiTheme="minorHAnsi"/>
+          <w:lang w:val="es-ES"/>
+        </w:rPr>
+      </w:pPr>
+      <w:r>
+        <w:rPr>
+          <w:rFonts w:asciiTheme="minorHAnsi" w:hAnsiTheme="minorHAnsi"/>
+          <w:lang w:val="es-ES"/>
+        </w:rPr>
+        <w:t>E2. Impresora no disponible</w:t>
       </w:r>
     </w:p>
     <w:p>
@@ -1429,96 +1529,6 @@
           <w:lang w:val="es-ES"/>
         </w:rPr>
         <w:lastRenderedPageBreak/>
-        <w:t xml:space="preserve">  - Al aumentar cantidad, el sistema detecta stock insuficiente.</w:t>
-      </w:r>
-    </w:p>
-    <w:p>
-      <w:pPr>
-        <w:rPr>
-          <w:rFonts w:asciiTheme="minorHAnsi" w:hAnsiTheme="minorHAnsi"/>
-          <w:lang w:val="es-ES"/>
-        </w:rPr>
-      </w:pPr>
-      <w:r>
-        <w:rPr>
-          <w:rFonts w:asciiTheme="minorHAnsi" w:hAnsiTheme="minorHAnsi"/>
-          <w:lang w:val="es-ES"/>
-        </w:rPr>
-        <w:t xml:space="preserve">  - El sistema impide finalizar o sugiere reducir cantidad, según configuración.</w:t>
-      </w:r>
-    </w:p>
-    <w:p>
-      <w:pPr>
-        <w:rPr>
-          <w:rFonts w:asciiTheme="minorHAnsi" w:hAnsiTheme="minorHAnsi"/>
-          <w:lang w:val="es-ES"/>
-        </w:rPr>
-      </w:pPr>
-      <w:r>
-        <w:rPr>
-          <w:rFonts w:asciiTheme="minorHAnsi" w:hAnsiTheme="minorHAnsi"/>
-          <w:lang w:val="es-ES"/>
-        </w:rPr>
-        <w:t>E1. Pago con tarjeta rechazado</w:t>
-      </w:r>
-    </w:p>
-    <w:p>
-      <w:pPr>
-        <w:rPr>
-          <w:rFonts w:asciiTheme="minorHAnsi" w:hAnsiTheme="minorHAnsi"/>
-          <w:lang w:val="es-ES"/>
-        </w:rPr>
-      </w:pPr>
-      <w:r>
-        <w:rPr>
-          <w:rFonts w:asciiTheme="minorHAnsi" w:hAnsiTheme="minorHAnsi"/>
-          <w:lang w:val="es-ES"/>
-        </w:rPr>
-        <w:t xml:space="preserve">  - El proveedor rechaza la operación.</w:t>
-      </w:r>
-    </w:p>
-    <w:p>
-      <w:pPr>
-        <w:rPr>
-          <w:rFonts w:asciiTheme="minorHAnsi" w:hAnsiTheme="minorHAnsi"/>
-          <w:lang w:val="es-ES"/>
-        </w:rPr>
-      </w:pPr>
-      <w:r>
-        <w:rPr>
-          <w:rFonts w:asciiTheme="minorHAnsi" w:hAnsiTheme="minorHAnsi"/>
-          <w:lang w:val="es-ES"/>
-        </w:rPr>
-        <w:t xml:space="preserve">  - El sistema mantiene la venta 'en curso' o 'pendiente de pago' y permite reintentar o cambiar método.</w:t>
-      </w:r>
-    </w:p>
-    <w:p>
-      <w:pPr>
-        <w:rPr>
-          <w:rFonts w:asciiTheme="minorHAnsi" w:hAnsiTheme="minorHAnsi"/>
-          <w:lang w:val="es-ES"/>
-        </w:rPr>
-      </w:pPr>
-      <w:r>
-        <w:rPr>
-          <w:rFonts w:asciiTheme="minorHAnsi" w:hAnsiTheme="minorHAnsi"/>
-          <w:lang w:val="es-ES"/>
-        </w:rPr>
-        <w:t>E2. Impresora no disponible</w:t>
-      </w:r>
-    </w:p>
-    <w:p>
-      <w:pPr>
-        <w:rPr>
-          <w:rFonts w:asciiTheme="minorHAnsi" w:hAnsiTheme="minorHAnsi"/>
-          <w:lang w:val="es-ES"/>
-        </w:rPr>
-      </w:pPr>
-      <w:r>
-        <w:rPr>
-          <w:rFonts w:asciiTheme="minorHAnsi" w:hAnsiTheme="minorHAnsi"/>
-          <w:lang w:val="es-ES"/>
-        </w:rPr>
         <w:t xml:space="preserve">  - Al finalizar, falla la impresión.</w:t>
       </w:r>
     </w:p>
@@ -1585,8 +1595,14 @@
     <w:p>
       <w:pPr>
         <w:pStyle w:val="Ttulo2"/>
-      </w:pPr>
-      <w:r>
+        <w:rPr>
+          <w:lang w:val="es-ES"/>
+        </w:rPr>
+      </w:pPr>
+      <w:r>
+        <w:rPr>
+          <w:lang w:val="es-ES"/>
+        </w:rPr>
         <w:t>9. Datos</w:t>
       </w:r>
     </w:p>
@@ -1681,8 +1697,14 @@
     <w:p>
       <w:pPr>
         <w:pStyle w:val="Ttulo2"/>
-      </w:pPr>
-      <w:r>
+        <w:rPr>
+          <w:lang w:val="es-ES"/>
+        </w:rPr>
+      </w:pPr>
+      <w:r>
+        <w:rPr>
+          <w:lang w:val="es-ES"/>
+        </w:rPr>
         <w:t>10. UI/UX</w:t>
       </w:r>
     </w:p>
@@ -1769,8 +1791,14 @@
     <w:p>
       <w:pPr>
         <w:pStyle w:val="Ttulo2"/>
-      </w:pPr>
-      <w:r>
+        <w:rPr>
+          <w:lang w:val="es-ES"/>
+        </w:rPr>
+      </w:pPr>
+      <w:r>
+        <w:rPr>
+          <w:lang w:val="es-ES"/>
+        </w:rPr>
         <w:t>11. Seguridad y permisos</w:t>
       </w:r>
     </w:p>
@@ -1848,7 +1876,6 @@
         <w:pStyle w:val="Ttulo2"/>
       </w:pPr>
       <w:r>
-        <w:lastRenderedPageBreak/>
         <w:t>12. Requisitos no funcionales</w:t>
       </w:r>
     </w:p>
@@ -1989,7 +2016,7 @@
           <w:rFonts w:asciiTheme="minorHAnsi" w:hAnsiTheme="minorHAnsi"/>
           <w:lang w:val="es-ES"/>
         </w:rPr>
-        <w:t xml:space="preserve">: catálogo, stock, ventas, pagos (si aplica), emisión de </w:t>
+        <w:t xml:space="preserve">: catálogo, ventas, pagos (si aplica), emisión de </w:t>
       </w:r>
       <w:proofErr w:type="gramStart"/>
       <w:r>
@@ -2059,6 +2086,7 @@
         <w:rPr>
           <w:lang w:val="es-ES"/>
         </w:rPr>
+        <w:lastRenderedPageBreak/>
         <w:t>14. Criterios de aceptación</w:t>
       </w:r>
     </w:p>
@@ -2477,9 +2505,9 @@
       </w:r>
     </w:p>
     <w:sectPr>
-      <w:footerReference w:type="default" r:id="rId7"/>
+      <w:footerReference w:type="default" r:id="rId8"/>
       <w:pgSz w:w="12240" w:h="15840"/>
-      <w:pgMar w:top="1440" w:right="1800" w:bottom="1440" w:left="1800" w:header="720" w:footer="720" w:gutter="0"/>
+      <w:pgMar w:top="1440" w:right="1800" w:bottom="1276" w:left="1800" w:header="850" w:footer="720" w:gutter="0"/>
       <w:cols w:space="720"/>
       <w:docGrid w:linePitch="360"/>
     </w:sectPr>
@@ -2568,21 +2596,7 @@
               <w:rFonts w:asciiTheme="minorHAnsi" w:hAnsiTheme="minorHAnsi"/>
               <w:lang w:val="es-ES"/>
             </w:rPr>
-            <w:t>F</w:t>
-          </w:r>
-          <w:r>
-            <w:rPr>
-              <w:rFonts w:asciiTheme="minorHAnsi" w:hAnsiTheme="minorHAnsi"/>
-              <w:lang w:val="es-ES"/>
-            </w:rPr>
-            <w:t>e</w:t>
-          </w:r>
-          <w:r>
-            <w:rPr>
-              <w:rFonts w:asciiTheme="minorHAnsi" w:hAnsiTheme="minorHAnsi"/>
-              <w:lang w:val="es-ES"/>
-            </w:rPr>
-            <w:t>cha</w:t>
+            <w:t>Fecha</w:t>
           </w:r>
         </w:p>
       </w:tc>
@@ -5010,4 +5024,16 @@
     </a:ext>
   </a:extLst>
 </a:theme>
+</file>
+
+<file path=customXml/item1.xml><?xml version="1.0" encoding="utf-8"?>
+<b:Sources xmlns:b="http://schemas.openxmlformats.org/officeDocument/2006/bibliography" xmlns="http://schemas.openxmlformats.org/officeDocument/2006/bibliography" SelectedStyle="\APASixthEditionOfficeOnline.xsl" StyleName="APA" Version="6"/>
+</file>
+
+<file path=customXml/itemProps1.xml><?xml version="1.0" encoding="utf-8"?>
+<ds:datastoreItem xmlns:ds="http://schemas.openxmlformats.org/officeDocument/2006/customXml" ds:itemID="{7F04F82D-A93F-4810-A8F0-BAB8E6DE7AC4}">
+  <ds:schemaRefs>
+    <ds:schemaRef ds:uri="http://schemas.openxmlformats.org/officeDocument/2006/bibliography"/>
+  </ds:schemaRefs>
+</ds:datastoreItem>
 </file>
</xml_diff>